<commit_message>
Added footer pages and changes in DOC file
</commit_message>
<xml_diff>
--- a/Beyondcode-CMS-DOC.docx
+++ b/Beyondcode-CMS-DOC.docx
@@ -5,7 +5,7 @@
     <w:p>
       <w:r>
         <w:pict w14:anchorId="4D9CD6A7">
-          <v:rect id="_x0000_i1091" style="width:0;height:1.5pt" o:hralign="center" o:hrstd="t" o:hr="t" fillcolor="#a0a0a0" stroked="f"/>
+          <v:rect id="_x0000_i1025" style="width:0;height:1.5pt" o:hralign="center" o:hrstd="t" o:hr="t" fillcolor="#a0a0a0" stroked="f"/>
         </w:pict>
       </w:r>
     </w:p>
@@ -117,7 +117,7 @@
     <w:p>
       <w:r>
         <w:pict w14:anchorId="14E3B18B">
-          <v:rect id="_x0000_i1092" style="width:0;height:1.5pt" o:hralign="center" o:hrstd="t" o:hr="t" fillcolor="#a0a0a0" stroked="f"/>
+          <v:rect id="_x0000_i1026" style="width:0;height:1.5pt" o:hralign="center" o:hrstd="t" o:hr="t" fillcolor="#a0a0a0" stroked="f"/>
         </w:pict>
       </w:r>
     </w:p>
@@ -370,7 +370,7 @@
       <w:r>
         <w:lastRenderedPageBreak/>
         <w:pict w14:anchorId="7E1ED20C">
-          <v:rect id="_x0000_i1093" style="width:0;height:1.5pt" o:hralign="center" o:hrstd="t" o:hr="t" fillcolor="#a0a0a0" stroked="f"/>
+          <v:rect id="_x0000_i1027" style="width:0;height:1.5pt" o:hralign="center" o:hrstd="t" o:hr="t" fillcolor="#a0a0a0" stroked="f"/>
         </w:pict>
       </w:r>
     </w:p>
@@ -539,7 +539,7 @@
     <w:p>
       <w:r>
         <w:pict w14:anchorId="7F6D0B2B">
-          <v:rect id="_x0000_i1094" style="width:0;height:1.5pt" o:hralign="center" o:hrstd="t" o:hr="t" fillcolor="#a0a0a0" stroked="f"/>
+          <v:rect id="_x0000_i1028" style="width:0;height:1.5pt" o:hralign="center" o:hrstd="t" o:hr="t" fillcolor="#a0a0a0" stroked="f"/>
         </w:pict>
       </w:r>
     </w:p>
@@ -635,7 +635,7 @@
     <w:p>
       <w:r>
         <w:pict w14:anchorId="155277B8">
-          <v:rect id="_x0000_i1095" style="width:0;height:1.5pt" o:hralign="center" o:hrstd="t" o:hr="t" fillcolor="#a0a0a0" stroked="f"/>
+          <v:rect id="_x0000_i1029" style="width:0;height:1.5pt" o:hralign="center" o:hrstd="t" o:hr="t" fillcolor="#a0a0a0" stroked="f"/>
         </w:pict>
       </w:r>
     </w:p>
@@ -721,7 +721,7 @@
     <w:p>
       <w:r>
         <w:pict w14:anchorId="17C79481">
-          <v:rect id="_x0000_i1096" style="width:0;height:1.5pt" o:hralign="center" o:hrstd="t" o:hr="t" fillcolor="#a0a0a0" stroked="f"/>
+          <v:rect id="_x0000_i1030" style="width:0;height:1.5pt" o:hralign="center" o:hrstd="t" o:hr="t" fillcolor="#a0a0a0" stroked="f"/>
         </w:pict>
       </w:r>
     </w:p>
@@ -811,7 +811,7 @@
     <w:p>
       <w:r>
         <w:pict w14:anchorId="5E98D75A">
-          <v:rect id="_x0000_i1097" style="width:0;height:1.5pt" o:hralign="center" o:hrstd="t" o:hr="t" fillcolor="#a0a0a0" stroked="f"/>
+          <v:rect id="_x0000_i1031" style="width:0;height:1.5pt" o:hralign="center" o:hrstd="t" o:hr="t" fillcolor="#a0a0a0" stroked="f"/>
         </w:pict>
       </w:r>
     </w:p>
@@ -907,7 +907,7 @@
     <w:p>
       <w:r>
         <w:pict w14:anchorId="288A8445">
-          <v:rect id="_x0000_i1098" style="width:0;height:1.5pt" o:hralign="center" o:hrstd="t" o:hr="t" fillcolor="#a0a0a0" stroked="f"/>
+          <v:rect id="_x0000_i1032" style="width:0;height:1.5pt" o:hralign="center" o:hrstd="t" o:hr="t" fillcolor="#a0a0a0" stroked="f"/>
         </w:pict>
       </w:r>
     </w:p>
@@ -1019,7 +1019,7 @@
     <w:p>
       <w:r>
         <w:pict w14:anchorId="6501061C">
-          <v:rect id="_x0000_i1099" style="width:0;height:1.5pt" o:hralign="center" o:hrstd="t" o:hr="t" fillcolor="#a0a0a0" stroked="f"/>
+          <v:rect id="_x0000_i1033" style="width:0;height:1.5pt" o:hralign="center" o:hrstd="t" o:hr="t" fillcolor="#a0a0a0" stroked="f"/>
         </w:pict>
       </w:r>
     </w:p>
@@ -1116,7 +1116,7 @@
     <w:p>
       <w:r>
         <w:pict w14:anchorId="73543F1A">
-          <v:rect id="_x0000_i1100" style="width:0;height:1.5pt" o:hralign="center" o:hrstd="t" o:hr="t" fillcolor="#a0a0a0" stroked="f"/>
+          <v:rect id="_x0000_i1034" style="width:0;height:1.5pt" o:hralign="center" o:hrstd="t" o:hr="t" fillcolor="#a0a0a0" stroked="f"/>
         </w:pict>
       </w:r>
     </w:p>
@@ -1250,7 +1250,7 @@
     <w:p>
       <w:r>
         <w:pict w14:anchorId="0205CDF9">
-          <v:rect id="_x0000_i1101" style="width:0;height:1.5pt" o:hralign="center" o:hrstd="t" o:hr="t" fillcolor="#a0a0a0" stroked="f"/>
+          <v:rect id="_x0000_i1035" style="width:0;height:1.5pt" o:hralign="center" o:hrstd="t" o:hr="t" fillcolor="#a0a0a0" stroked="f"/>
         </w:pict>
       </w:r>
     </w:p>
@@ -1307,6 +1307,67 @@
       </w:r>
       <w:r>
         <w:t>, all content can be updated dynamically without modifying the source code.</w:t>
+      </w:r>
+      <w:r>
+        <w:br/>
+      </w:r>
+      <w:r>
+        <w:br/>
+      </w:r>
+      <w:r>
+        <w:rPr>
+          <w:b/>
+          <w:bCs/>
+        </w:rPr>
+        <w:t xml:space="preserve">Remain Task: </w:t>
+      </w:r>
+      <w:proofErr w:type="spellStart"/>
+      <w:r>
+        <w:rPr>
+          <w:b/>
+          <w:bCs/>
+        </w:rPr>
+        <w:t>EditorJs</w:t>
+      </w:r>
+      <w:proofErr w:type="spellEnd"/>
+      <w:r>
+        <w:rPr>
+          <w:b/>
+          <w:bCs/>
+        </w:rPr>
+        <w:t xml:space="preserve"> or </w:t>
+      </w:r>
+      <w:proofErr w:type="spellStart"/>
+      <w:r>
+        <w:rPr>
+          <w:b/>
+          <w:bCs/>
+        </w:rPr>
+        <w:t>PageBuilder</w:t>
+      </w:r>
+      <w:proofErr w:type="spellEnd"/>
+      <w:r>
+        <w:rPr>
+          <w:b/>
+          <w:bCs/>
+        </w:rPr>
+        <w:t xml:space="preserve"> is Not proper working so we didn’t add this. We tried to fulfil you </w:t>
+      </w:r>
+      <w:proofErr w:type="spellStart"/>
+      <w:r>
+        <w:rPr>
+          <w:b/>
+          <w:bCs/>
+        </w:rPr>
+        <w:t>requirments</w:t>
+      </w:r>
+      <w:proofErr w:type="spellEnd"/>
+      <w:r>
+        <w:rPr>
+          <w:b/>
+          <w:bCs/>
+        </w:rPr>
+        <w:t xml:space="preserve">.  </w:t>
       </w:r>
     </w:p>
     <w:p/>
@@ -4020,6 +4081,7 @@
   <w:style w:type="character" w:default="1" w:styleId="DefaultParagraphFont">
     <w:name w:val="Default Paragraph Font"/>
     <w:uiPriority w:val="1"/>
+    <w:semiHidden/>
     <w:unhideWhenUsed/>
   </w:style>
   <w:style w:type="table" w:default="1" w:styleId="TableNormal">

</xml_diff>